<commit_message>
Rebuild DOCX with working TOC anchors
Picks up general-repo v0.22.43 hardened anchor-rewrite. All TOC
entries now resolve to their destination headings instead of
clicking to the top of the document.
</commit_message>
<xml_diff>
--- a/docs/Instats - Australia's Gas Export Tax Revenue.docx
+++ b/docs/Instats - Australia's Gas Export Tax Revenue.docx
@@ -936,7 +936,7 @@
         <w:pStyle w:val="Heading4"/>
         <w:rPr/>
       </w:pPr>
-      <w:hyperlink w:anchor="X8eb7381e2a8b189ff29d0aa0b702ee54abe0fd2">
+      <w:hyperlink w:anchor="X1a4b3dc9aaab62b2f0f5408f14720f3b64e112f">
         <w:bookmarkStart w:id="5" w:name="part-1-what-australia-actually-collects"/>
         <w:r>
           <w:rPr>
@@ -955,7 +955,7 @@
         </w:numPr>
         <w:rPr/>
       </w:pPr>
-      <w:hyperlink w:anchor="Xa4a00580d3056e10f75fe5b98d17695fd389adc">
+      <w:hyperlink w:anchor="the-four-heads-of-revenue">
         <w:r>
           <w:rPr>
             <w:rStyle w:val="Hyperlink"/>
@@ -973,7 +973,7 @@
         </w:numPr>
         <w:rPr/>
       </w:pPr>
-      <w:hyperlink w:anchor="Xcf21b791eab80b7e94776bc80bec3e519df06f2">
+      <w:hyperlink w:anchor="Xe13845fae167eea2339b28eb35276fd556d6152">
         <w:r>
           <w:rPr>
             <w:rStyle w:val="Hyperlink"/>
@@ -991,7 +991,7 @@
         </w:numPr>
         <w:rPr/>
       </w:pPr>
-      <w:hyperlink w:anchor="Xc5c9dfb021fddb1b8119f5fb6dd5764746b049b">
+      <w:hyperlink w:anchor="X252e17b03b81339e022f9dbd70329aefe833ba1">
         <w:r>
           <w:rPr>
             <w:rStyle w:val="Hyperlink"/>
@@ -1009,7 +1009,7 @@
         </w:numPr>
         <w:rPr/>
       </w:pPr>
-      <w:hyperlink w:anchor="Xfb75e06f762187a3a873b2858a842706ee67da2">
+      <w:hyperlink w:anchor="X080557cc327bbef43ce9f15ef994d50be6a0295">
         <w:r>
           <w:rPr>
             <w:rStyle w:val="Hyperlink"/>
@@ -1027,7 +1027,7 @@
         </w:numPr>
         <w:rPr/>
       </w:pPr>
-      <w:hyperlink w:anchor="X06c0ece890674efc080050cbd448515a7ffff8e">
+      <w:hyperlink w:anchor="Xdd708ad0fe4d1c3aaa8f5938836bf3565bc74e5">
         <w:r>
           <w:rPr>
             <w:rStyle w:val="Hyperlink"/>
@@ -1042,7 +1042,7 @@
         <w:pStyle w:val="Heading4"/>
         <w:rPr/>
       </w:pPr>
-      <w:hyperlink w:anchor="Xb5d195b6178af8534aa9e9eab66ffb67aa6a9e1">
+      <w:hyperlink w:anchor="Xd06a277a4852705eedaadaabf913589ac71c782">
         <w:bookmarkStart w:id="6" w:name="Xd71e7d8486524f410788e3a3382bd56a9409587"/>
         <w:r>
           <w:rPr>
@@ -1061,7 +1061,7 @@
         </w:numPr>
         <w:rPr/>
       </w:pPr>
-      <w:hyperlink w:anchor="X46e066611b7be367e054dc1a702021beb053ce0">
+      <w:hyperlink w:anchor="the-beer-versus-prrt-exchange">
         <w:r>
           <w:rPr>
             <w:rStyle w:val="Hyperlink"/>
@@ -1079,7 +1079,7 @@
         </w:numPr>
         <w:rPr/>
       </w:pPr>
-      <w:hyperlink w:anchor="X7648b82aa587314acb2a4b98d7d106b6c28ed5f">
+      <w:hyperlink w:anchor="the-wider-comparator-picture">
         <w:r>
           <w:rPr>
             <w:rStyle w:val="Hyperlink"/>
@@ -1097,7 +1097,7 @@
         </w:numPr>
         <w:rPr/>
       </w:pPr>
-      <w:hyperlink w:anchor="Xe4b3e4bec663cd63f901273ed0b30512acda275">
+      <w:hyperlink w:anchor="X376188126d7d626b75e6957f34627b112bd5442">
         <w:r>
           <w:rPr>
             <w:rStyle w:val="Hyperlink"/>
@@ -1112,7 +1112,7 @@
         <w:pStyle w:val="Heading4"/>
         <w:rPr/>
       </w:pPr>
-      <w:hyperlink w:anchor="part-3-how-other-countries-do-this_1">
+      <w:hyperlink w:anchor="part-3-how-other-countries-do-this-1">
         <w:bookmarkStart w:id="7" w:name="part-3-how-other-countries-do-this"/>
         <w:r>
           <w:rPr>
@@ -1131,7 +1131,7 @@
         </w:numPr>
         <w:rPr/>
       </w:pPr>
-      <w:hyperlink w:anchor="Xa6338a95a3aa6e9d4d4000c98038a4fceb5df69">
+      <w:hyperlink w:anchor="norway-the-gold-standard">
         <w:r>
           <w:rPr>
             <w:rStyle w:val="Hyperlink"/>
@@ -1149,7 +1149,7 @@
         </w:numPr>
         <w:rPr/>
       </w:pPr>
-      <w:hyperlink w:anchor="X952919bff3aabc2622a5b058e26f20c1717bfde">
+      <w:hyperlink w:anchor="qatar-state-ownership-replaces-tax">
         <w:r>
           <w:rPr>
             <w:rStyle w:val="Hyperlink"/>
@@ -1167,7 +1167,7 @@
         </w:numPr>
         <w:rPr/>
       </w:pPr>
-      <w:hyperlink w:anchor="Xfdb12ce3534c43390734ac4a90161f5faee6c77">
+      <w:hyperlink w:anchor="Xfbdcd22e88daa2f168cc1f5cb4a1f13548d89da">
         <w:r>
           <w:rPr>
             <w:rStyle w:val="Hyperlink"/>
@@ -1185,7 +1185,7 @@
         </w:numPr>
         <w:rPr/>
       </w:pPr>
-      <w:hyperlink w:anchor="Xf93aa3f5c6fb027403b124f86a4cb8e555e2c24">
+      <w:hyperlink w:anchor="X461e4c001d0dabd2bc5518fb53d279db5beebc5">
         <w:r>
           <w:rPr>
             <w:rStyle w:val="Hyperlink"/>
@@ -1203,7 +1203,7 @@
         </w:numPr>
         <w:rPr/>
       </w:pPr>
-      <w:hyperlink w:anchor="Xf7aa47a6691c1edaa7d869355a3db8b34b806a7">
+      <w:hyperlink w:anchor="X7a662448b696dd36504a64855625d881856ed19">
         <w:r>
           <w:rPr>
             <w:rStyle w:val="Hyperlink"/>
@@ -1221,7 +1221,7 @@
         </w:numPr>
         <w:rPr/>
       </w:pPr>
-      <w:hyperlink w:anchor="X0f5f7291aa6d8d89a19894c1ea81b9e2b95a017">
+      <w:hyperlink w:anchor="japan-the-destination-market-angle">
         <w:r>
           <w:rPr>
             <w:rStyle w:val="Hyperlink"/>
@@ -1239,7 +1239,7 @@
         </w:numPr>
         <w:rPr/>
       </w:pPr>
-      <w:hyperlink w:anchor="X88168bf3e6d8b4d4f391d52ee29bb96821f3d5c">
+      <w:hyperlink w:anchor="the-middle-east-lesson">
         <w:r>
           <w:rPr>
             <w:rStyle w:val="Hyperlink"/>
@@ -1254,7 +1254,7 @@
         <w:pStyle w:val="Heading4"/>
         <w:rPr/>
       </w:pPr>
-      <w:hyperlink w:anchor="X83668cd0f25fa165a365abc28f694291fdab17d">
+      <w:hyperlink w:anchor="Xba63d7e9976ba0de5e0ea7fcd2177cff4b3c808">
         <w:bookmarkStart w:id="8" w:name="Xda87968ad6adc1a5b6b25f2d6c5d48a99e42b6e"/>
         <w:r>
           <w:rPr>
@@ -1273,7 +1273,7 @@
         </w:numPr>
         <w:rPr/>
       </w:pPr>
-      <w:hyperlink w:anchor="X93824a89579ba39d4b930977c2b365c6dcbf9cc">
+      <w:hyperlink w:anchor="we-paid-for-the-infrastructure">
         <w:r>
           <w:rPr>
             <w:rStyle w:val="Hyperlink"/>
@@ -1291,7 +1291,7 @@
         </w:numPr>
         <w:rPr/>
       </w:pPr>
-      <w:hyperlink w:anchor="Xaa222d7f6acb36dd4b670d14bedff5f9ceab3f6">
+      <w:hyperlink w:anchor="X64c5b387bc0fae18c4f8104639ce9b13f600d89">
         <w:r>
           <w:rPr>
             <w:rStyle w:val="Hyperlink"/>
@@ -1309,7 +1309,7 @@
         </w:numPr>
         <w:rPr/>
       </w:pPr>
-      <w:hyperlink w:anchor="Xb12e9b55f366e827cd9f622aeb1cbd2e753c6ea">
+      <w:hyperlink w:anchor="Xbd9d62166b5fce8f1d8780be19e05e7f373dfd8">
         <w:r>
           <w:rPr>
             <w:rStyle w:val="Hyperlink"/>
@@ -1327,7 +1327,7 @@
         </w:numPr>
         <w:rPr/>
       </w:pPr>
-      <w:hyperlink w:anchor="Xaccbd30f65e027f53bb0375af6ac2e36af0e2bd">
+      <w:hyperlink w:anchor="the-2023-reforms-already-happened">
         <w:r>
           <w:rPr>
             <w:rStyle w:val="Hyperlink"/>
@@ -1345,7 +1345,7 @@
         </w:numPr>
         <w:rPr/>
       </w:pPr>
-      <w:hyperlink w:anchor="Xacaf8928d389920f18562dcb36667fd8e9a3fda">
+      <w:hyperlink w:anchor="we-do-pay-a21_9-billion-in-2024-25">
         <w:r>
           <w:rPr>
             <w:rStyle w:val="Hyperlink"/>
@@ -1363,7 +1363,7 @@
         </w:numPr>
         <w:rPr/>
       </w:pPr>
-      <w:hyperlink w:anchor="Xd7081d5b2cc83fa833aa7bf1b83d0fdb9cd182f">
+      <w:hyperlink w:anchor="what-survives-the-critique">
         <w:r>
           <w:rPr>
             <w:rStyle w:val="Hyperlink"/>
@@ -1378,7 +1378,7 @@
         <w:pStyle w:val="Heading4"/>
         <w:rPr/>
       </w:pPr>
-      <w:hyperlink w:anchor="X7a272a2035ec9d6da01afa0c743b4f7ded31476">
+      <w:hyperlink w:anchor="X6633831a9d76fbc0697702b1fe0ffdec02c7e5e">
         <w:bookmarkStart w:id="9" w:name="part-5-what-a17-billion-a-year-would-buy"/>
         <w:r>
           <w:rPr>
@@ -1397,7 +1397,7 @@
         </w:numPr>
         <w:rPr/>
       </w:pPr>
-      <w:hyperlink w:anchor="X505abfc2310b8359428efa69a07f485fe9c05e3">
+      <w:hyperlink w:anchor="childcare-universal-access">
         <w:r>
           <w:rPr>
             <w:rStyle w:val="Hyperlink"/>
@@ -1415,7 +1415,7 @@
         </w:numPr>
         <w:rPr/>
       </w:pPr>
-      <w:hyperlink w:anchor="X3a341d887335c4afa77a76699ace6e834455144">
+      <w:hyperlink w:anchor="university-tafe-and-hecs-help">
         <w:r>
           <w:rPr>
             <w:rStyle w:val="Hyperlink"/>
@@ -1433,7 +1433,7 @@
         </w:numPr>
         <w:rPr/>
       </w:pPr>
-      <w:hyperlink w:anchor="X0e748be7c899d5a0e254a81103cd04d04bce760">
+      <w:hyperlink w:anchor="medicare-expansion">
         <w:r>
           <w:rPr>
             <w:rStyle w:val="Hyperlink"/>
@@ -1451,7 +1451,7 @@
         </w:numPr>
         <w:rPr/>
       </w:pPr>
-      <w:hyperlink w:anchor="Xe2da354196ffb0a565ed16acc68f5844d8c079e">
+      <w:hyperlink w:anchor="housing">
         <w:r>
           <w:rPr>
             <w:rStyle w:val="Hyperlink"/>
@@ -1469,7 +1469,7 @@
         </w:numPr>
         <w:rPr/>
       </w:pPr>
-      <w:hyperlink w:anchor="X99904f1fcbbcc9277033c0b5ff6821fd5dee79f">
+      <w:hyperlink w:anchor="energy-bill-relief-the-irony">
         <w:r>
           <w:rPr>
             <w:rStyle w:val="Hyperlink"/>
@@ -1487,7 +1487,7 @@
         </w:numPr>
         <w:rPr/>
       </w:pPr>
-      <w:hyperlink w:anchor="X6b48dbf96c05557e4fd786cff65ebb746bfa135">
+      <w:hyperlink w:anchor="Xdc4c3ed8fe230228d9cc1de49bc2b38660646af">
         <w:r>
           <w:rPr>
             <w:rStyle w:val="Hyperlink"/>
@@ -1505,7 +1505,7 @@
         </w:numPr>
         <w:rPr/>
       </w:pPr>
-      <w:hyperlink w:anchor="Xd6751e92453d8335160b2dfd5e5f2a49676f548">
+      <w:hyperlink w:anchor="defence-and-aukus">
         <w:r>
           <w:rPr>
             <w:rStyle w:val="Hyperlink"/>
@@ -1520,7 +1520,7 @@
         <w:pStyle w:val="Heading4"/>
         <w:rPr/>
       </w:pPr>
-      <w:hyperlink w:anchor="part-6-recommendations_1">
+      <w:hyperlink w:anchor="part-6-recommendations-1">
         <w:bookmarkStart w:id="10" w:name="part-6-recommendations"/>
         <w:r>
           <w:rPr>
@@ -1539,7 +1539,7 @@
         </w:numPr>
         <w:rPr/>
       </w:pPr>
-      <w:hyperlink w:anchor="Xf8e3c3e53c7e4690a8a7cb6965a6efaaf4b4bf7">
+      <w:hyperlink w:anchor="Xbf471b600eda720212757b843d5ad4f42726a33">
         <w:r>
           <w:rPr>
             <w:rStyle w:val="Hyperlink"/>
@@ -1557,7 +1557,7 @@
         </w:numPr>
         <w:rPr/>
       </w:pPr>
-      <w:hyperlink w:anchor="X6b305f047b5c992279cb206ed99ca6c445edaf7">
+      <w:hyperlink w:anchor="X2a95d18314906e814850a026539732850647bc5">
         <w:r>
           <w:rPr>
             <w:rStyle w:val="Hyperlink"/>
@@ -1575,7 +1575,7 @@
         </w:numPr>
         <w:rPr/>
       </w:pPr>
-      <w:hyperlink w:anchor="Xabb48e2fe122cc4b39e092a29d4a7185920d316">
+      <w:hyperlink w:anchor="X563b8ed265201744a32bc8898a19bba6f9043c1">
         <w:r>
           <w:rPr>
             <w:rStyle w:val="Hyperlink"/>
@@ -1593,7 +1593,7 @@
         </w:numPr>
         <w:rPr/>
       </w:pPr>
-      <w:hyperlink w:anchor="X125a38ddb390062fb5886f769a921a458111860">
+      <w:hyperlink w:anchor="X0921bfae629da4642dc1a12579e0d75e1ff505c">
         <w:r>
           <w:rPr>
             <w:rStyle w:val="Hyperlink"/>
@@ -1611,7 +1611,7 @@
         </w:numPr>
         <w:rPr/>
       </w:pPr>
-      <w:hyperlink w:anchor="Xad3d02f68731ba493fd57d1e199d708168f3ac0">
+      <w:hyperlink w:anchor="X4cdde95b96722cfc07e47a223890103cd7782f4">
         <w:r>
           <w:rPr>
             <w:rStyle w:val="Hyperlink"/>
@@ -1626,7 +1626,7 @@
         <w:pStyle w:val="Heading4"/>
         <w:rPr/>
       </w:pPr>
-      <w:hyperlink w:anchor="conclusion_1">
+      <w:hyperlink w:anchor="conclusion-1">
         <w:bookmarkStart w:id="11" w:name="conclusion"/>
         <w:r>
           <w:rPr>
@@ -1642,7 +1642,7 @@
         <w:pStyle w:val="Heading4"/>
         <w:rPr/>
       </w:pPr>
-      <w:hyperlink w:anchor="appendix-a-headline-data-table_1">
+      <w:hyperlink w:anchor="appendix-a-headline-data-table-1">
         <w:bookmarkStart w:id="12" w:name="appendix-a-headline-data-table"/>
         <w:r>
           <w:rPr>
@@ -1658,7 +1658,7 @@
         <w:pStyle w:val="Heading4"/>
         <w:rPr/>
       </w:pPr>
-      <w:hyperlink w:anchor="appendix-b-public-source-package_1">
+      <w:hyperlink w:anchor="appendix-b-public-source-package-1">
         <w:bookmarkStart w:id="13" w:name="appendix-b-public-source-package"/>
         <w:r>
           <w:rPr>
@@ -1674,7 +1674,7 @@
         <w:pStyle w:val="Heading4"/>
         <w:rPr/>
       </w:pPr>
-      <w:hyperlink w:anchor="appendix-c-about-this-report_1">
+      <w:hyperlink w:anchor="appendix-c-about-this-report-1">
         <w:bookmarkStart w:id="14" w:name="appendix-c-about-this-report"/>
         <w:r>
           <w:rPr>
@@ -1690,7 +1690,7 @@
         <w:pStyle w:val="Heading4"/>
         <w:rPr/>
       </w:pPr>
-      <w:hyperlink w:anchor="sources-and-footnotes_1">
+      <w:hyperlink w:anchor="sources-and-footnotes-1">
         <w:bookmarkStart w:id="15" w:name="sources-and-footnotes"/>
         <w:r>
           <w:rPr>

</xml_diff>